<commit_message>
Add imodule instructions to audio guide
</commit_message>
<xml_diff>
--- a/docs/audio-hash-marker-word-guide.docx
+++ b/docs/audio-hash-marker-word-guide.docx
@@ -14,6 +14,73 @@
           <w:sz w:val="48"/>
         </w:rPr>
         <w:t>audio-hash-marker</w:t>
+      </w:r>
+    </w:p>
+    <w:p>
+      <w:pPr>
+        <w:pStyle w:val="Heading1"/>
+      </w:pPr>
+      <w:r>
+        <w:t>Cài lab bằng imodule</w:t>
+      </w:r>
+    </w:p>
+    <w:p>
+      <w:r>
+        <w:t>Trên máy Labtainer, mở terminal ngoài container và chạy lệnh sau để tải bài lab từ GitHub RAW:</w:t>
+      </w:r>
+    </w:p>
+    <w:p>
+      <w:pPr>
+        <w:pStyle w:val="CodeBlock"/>
+      </w:pPr>
+      <w:r>
+        <w:rPr>
+          <w:rFonts w:ascii="Consolas" w:hAnsi="Consolas"/>
+          <w:b w:val="0"/>
+          <w:sz w:val="18"/>
+        </w:rPr>
+        <w:t>imodule https://github.com/vuxvinh/KiThuatGiauTin/raw/main/audio-hash-marker.tar</w:t>
+      </w:r>
+    </w:p>
+    <w:p>
+      <w:r>
+        <w:t>Sau khi imodule tải xong, chạy lab bằng lệnh:</w:t>
+      </w:r>
+    </w:p>
+    <w:p>
+      <w:pPr>
+        <w:pStyle w:val="CodeBlock"/>
+      </w:pPr>
+      <w:r>
+        <w:rPr>
+          <w:rFonts w:ascii="Consolas" w:hAnsi="Consolas"/>
+          <w:b w:val="0"/>
+          <w:sz w:val="18"/>
+        </w:rPr>
+        <w:t>labtainer audio-hash-marker</w:t>
+      </w:r>
+    </w:p>
+    <w:p>
+      <w:r>
+        <w:t>Nếu muốn chạy lại lab từ đầu, dùng lệnh sau:</w:t>
+      </w:r>
+    </w:p>
+    <w:p>
+      <w:pPr>
+        <w:pStyle w:val="CodeBlock"/>
+      </w:pPr>
+      <w:r>
+        <w:rPr>
+          <w:rFonts w:ascii="Consolas" w:hAnsi="Consolas"/>
+          <w:b w:val="0"/>
+          <w:sz w:val="18"/>
+        </w:rPr>
+        <w:t>labtainer -r audio-hash-marker</w:t>
+      </w:r>
+    </w:p>
+    <w:p>
+      <w:r>
+        <w:t>Khi terminal container student mở ra, chạy ls để kiểm tra các file bài lab.</w:t>
       </w:r>
     </w:p>
     <w:p>

</xml_diff>